<commit_message>
Updated SOP document 2
</commit_message>
<xml_diff>
--- a/Git-SOP.docx
+++ b/Git-SOP.docx
@@ -124,8 +124,16 @@
         <w:rPr>
           <w:color w:val="2F5496" w:themeColor="accent1" w:themeShade="BF"/>
         </w:rPr>
-        <w:t>git add .</w:t>
-      </w:r>
+        <w:t xml:space="preserve">git </w:t>
+      </w:r>
+      <w:proofErr w:type="gramStart"/>
+      <w:r>
+        <w:rPr>
+          <w:color w:val="2F5496" w:themeColor="accent1" w:themeShade="BF"/>
+        </w:rPr>
+        <w:t>add .</w:t>
+      </w:r>
+      <w:proofErr w:type="gramEnd"/>
     </w:p>
     <w:p>
       <w:pPr>
@@ -294,23 +302,6 @@
     </w:p>
     <w:p>
       <w:pPr>
-        <w:ind w:left="720" w:firstLine="720"/>
-        <w:rPr>
-          <w:color w:val="2F5496" w:themeColor="accent1" w:themeShade="BF"/>
-        </w:rPr>
-      </w:pPr>
-    </w:p>
-    <w:p>
-      <w:pPr>
-        <w:pStyle w:val="ListParagraph"/>
-        <w:ind w:firstLine="720"/>
-        <w:rPr>
-          <w:color w:val="2F5496" w:themeColor="accent1" w:themeShade="BF"/>
-        </w:rPr>
-      </w:pPr>
-    </w:p>
-    <w:p>
-      <w:pPr>
         <w:pStyle w:val="ListParagraph"/>
         <w:numPr>
           <w:ilvl w:val="0"/>
@@ -343,6 +334,84 @@
           <w:ilvl w:val="0"/>
           <w:numId w:val="1"/>
         </w:numPr>
+      </w:pPr>
+      <w:r>
+        <w:t>Stage it</w:t>
+      </w:r>
+    </w:p>
+    <w:p>
+      <w:pPr>
+        <w:pStyle w:val="ListParagraph"/>
+        <w:ind w:left="1440"/>
+        <w:rPr>
+          <w:color w:val="2F5496" w:themeColor="accent1" w:themeShade="BF"/>
+        </w:rPr>
+      </w:pPr>
+      <w:r>
+        <w:rPr>
+          <w:color w:val="2F5496" w:themeColor="accent1" w:themeShade="BF"/>
+        </w:rPr>
+        <w:t>git add Git-SOP.docx</w:t>
+      </w:r>
+    </w:p>
+    <w:p>
+      <w:pPr>
+        <w:pStyle w:val="ListParagraph"/>
+        <w:numPr>
+          <w:ilvl w:val="0"/>
+          <w:numId w:val="1"/>
+        </w:numPr>
+      </w:pPr>
+      <w:r>
+        <w:t>Commit</w:t>
+      </w:r>
+    </w:p>
+    <w:p>
+      <w:pPr>
+        <w:pStyle w:val="ListParagraph"/>
+        <w:ind w:firstLine="720"/>
+        <w:rPr>
+          <w:color w:val="2F5496" w:themeColor="accent1" w:themeShade="BF"/>
+        </w:rPr>
+      </w:pPr>
+      <w:r>
+        <w:rPr>
+          <w:color w:val="2F5496" w:themeColor="accent1" w:themeShade="BF"/>
+        </w:rPr>
+        <w:t>git commit -m "Updated SOP document with new procedures"</w:t>
+      </w:r>
+    </w:p>
+    <w:p>
+      <w:pPr>
+        <w:pStyle w:val="ListParagraph"/>
+        <w:numPr>
+          <w:ilvl w:val="0"/>
+          <w:numId w:val="1"/>
+        </w:numPr>
+      </w:pPr>
+      <w:r>
+        <w:t>Push</w:t>
+      </w:r>
+    </w:p>
+    <w:p>
+      <w:pPr>
+        <w:pStyle w:val="ListParagraph"/>
+        <w:ind w:firstLine="720"/>
+        <w:rPr>
+          <w:color w:val="2F5496" w:themeColor="accent1" w:themeShade="BF"/>
+        </w:rPr>
+      </w:pPr>
+      <w:r>
+        <w:rPr>
+          <w:color w:val="2F5496" w:themeColor="accent1" w:themeShade="BF"/>
+        </w:rPr>
+        <w:t>Git push</w:t>
+      </w:r>
+    </w:p>
+    <w:p>
+      <w:pPr>
+        <w:pStyle w:val="ListParagraph"/>
+        <w:ind w:left="1440"/>
       </w:pPr>
     </w:p>
     <w:p>

</xml_diff>

<commit_message>
Updated SOP document 3
</commit_message>
<xml_diff>
--- a/Git-SOP.docx
+++ b/Git-SOP.docx
@@ -407,6 +407,12 @@
         </w:rPr>
         <w:t>Git push</w:t>
       </w:r>
+    </w:p>
+    <w:p>
+      <w:pPr>
+        <w:pStyle w:val="ListParagraph"/>
+        <w:ind w:left="1440"/>
+      </w:pPr>
     </w:p>
     <w:p>
       <w:pPr>

</xml_diff>

<commit_message>
Updated pipeline with logging
</commit_message>
<xml_diff>
--- a/Git-SOP.docx
+++ b/Git-SOP.docx
@@ -124,16 +124,8 @@
         <w:rPr>
           <w:color w:val="2F5496" w:themeColor="accent1" w:themeShade="BF"/>
         </w:rPr>
-        <w:t xml:space="preserve">git </w:t>
-      </w:r>
-      <w:proofErr w:type="gramStart"/>
-      <w:r>
-        <w:rPr>
-          <w:color w:val="2F5496" w:themeColor="accent1" w:themeShade="BF"/>
-        </w:rPr>
-        <w:t>add .</w:t>
-      </w:r>
-      <w:proofErr w:type="gramEnd"/>
+        <w:t>git add .</w:t>
+      </w:r>
     </w:p>
     <w:p>
       <w:pPr>
@@ -411,13 +403,629 @@
     <w:p>
       <w:pPr>
         <w:pStyle w:val="ListParagraph"/>
-        <w:ind w:left="1440"/>
-      </w:pPr>
-    </w:p>
-    <w:p>
-      <w:pPr>
-        <w:pStyle w:val="ListParagraph"/>
-        <w:ind w:left="1440"/>
+        <w:numPr>
+          <w:ilvl w:val="0"/>
+          <w:numId w:val="1"/>
+        </w:numPr>
+        <w:rPr>
+          <w:color w:val="2F5496" w:themeColor="accent1" w:themeShade="BF"/>
+        </w:rPr>
+      </w:pPr>
+      <w:r>
+        <w:t>Create GitHub Workflow Directory</w:t>
+      </w:r>
+    </w:p>
+    <w:p>
+      <w:pPr>
+        <w:pStyle w:val="ListParagraph"/>
+        <w:rPr>
+          <w:color w:val="2F5496" w:themeColor="accent1" w:themeShade="BF"/>
+        </w:rPr>
+      </w:pPr>
+      <w:r>
+        <w:rPr>
+          <w:color w:val="2F5496" w:themeColor="accent1" w:themeShade="BF"/>
+        </w:rPr>
+        <w:t>New-Item .</w:t>
+      </w:r>
+      <w:proofErr w:type="spellStart"/>
+      <w:r>
+        <w:rPr>
+          <w:color w:val="2F5496" w:themeColor="accent1" w:themeShade="BF"/>
+        </w:rPr>
+        <w:t>github</w:t>
+      </w:r>
+      <w:proofErr w:type="spellEnd"/>
+      <w:r>
+        <w:rPr>
+          <w:color w:val="2F5496" w:themeColor="accent1" w:themeShade="BF"/>
+        </w:rPr>
+        <w:t xml:space="preserve"> -ItemType Directory</w:t>
+      </w:r>
+    </w:p>
+    <w:p>
+      <w:pPr>
+        <w:pStyle w:val="ListParagraph"/>
+        <w:rPr>
+          <w:color w:val="2F5496" w:themeColor="accent1" w:themeShade="BF"/>
+        </w:rPr>
+      </w:pPr>
+      <w:r>
+        <w:rPr>
+          <w:color w:val="2F5496" w:themeColor="accent1" w:themeShade="BF"/>
+        </w:rPr>
+        <w:t>New-Item .</w:t>
+      </w:r>
+      <w:proofErr w:type="spellStart"/>
+      <w:r>
+        <w:rPr>
+          <w:color w:val="2F5496" w:themeColor="accent1" w:themeShade="BF"/>
+        </w:rPr>
+        <w:t>github</w:t>
+      </w:r>
+      <w:proofErr w:type="spellEnd"/>
+      <w:r>
+        <w:rPr>
+          <w:color w:val="2F5496" w:themeColor="accent1" w:themeShade="BF"/>
+        </w:rPr>
+        <w:t>\workflows -ItemType Directory</w:t>
+      </w:r>
+    </w:p>
+    <w:p>
+      <w:pPr>
+        <w:pStyle w:val="ListParagraph"/>
+        <w:numPr>
+          <w:ilvl w:val="0"/>
+          <w:numId w:val="1"/>
+        </w:numPr>
+      </w:pPr>
+      <w:r>
+        <w:t>Create Pipeline File</w:t>
+      </w:r>
+    </w:p>
+    <w:p>
+      <w:pPr>
+        <w:pStyle w:val="ListParagraph"/>
+        <w:rPr>
+          <w:color w:val="2F5496" w:themeColor="accent1" w:themeShade="BF"/>
+        </w:rPr>
+      </w:pPr>
+      <w:r>
+        <w:rPr>
+          <w:color w:val="2F5496" w:themeColor="accent1" w:themeShade="BF"/>
+        </w:rPr>
+        <w:t>New-Item .</w:t>
+      </w:r>
+      <w:proofErr w:type="spellStart"/>
+      <w:r>
+        <w:rPr>
+          <w:color w:val="2F5496" w:themeColor="accent1" w:themeShade="BF"/>
+        </w:rPr>
+        <w:t>github</w:t>
+      </w:r>
+      <w:proofErr w:type="spellEnd"/>
+      <w:r>
+        <w:rPr>
+          <w:color w:val="2F5496" w:themeColor="accent1" w:themeShade="BF"/>
+        </w:rPr>
+        <w:t>\workflows\run-</w:t>
+      </w:r>
+      <w:proofErr w:type="spellStart"/>
+      <w:r>
+        <w:rPr>
+          <w:color w:val="2F5496" w:themeColor="accent1" w:themeShade="BF"/>
+        </w:rPr>
+        <w:t>script.yml</w:t>
+      </w:r>
+      <w:proofErr w:type="spellEnd"/>
+    </w:p>
+    <w:p>
+      <w:pPr>
+        <w:pStyle w:val="ListParagraph"/>
+        <w:numPr>
+          <w:ilvl w:val="0"/>
+          <w:numId w:val="1"/>
+        </w:numPr>
+      </w:pPr>
+      <w:r>
+        <w:t>Add Pipeline Configuration</w:t>
+      </w:r>
+    </w:p>
+    <w:p>
+      <w:pPr>
+        <w:pStyle w:val="ListParagraph"/>
+      </w:pPr>
+      <w:r>
+        <w:t>Open run-</w:t>
+      </w:r>
+      <w:proofErr w:type="spellStart"/>
+      <w:r>
+        <w:t>script.yml</w:t>
+      </w:r>
+      <w:proofErr w:type="spellEnd"/>
+      <w:r>
+        <w:t xml:space="preserve"> and add:</w:t>
+      </w:r>
+    </w:p>
+    <w:p>
+      <w:pPr>
+        <w:pStyle w:val="ListParagraph"/>
+        <w:rPr>
+          <w:color w:val="2F5496" w:themeColor="accent1" w:themeShade="BF"/>
+        </w:rPr>
+      </w:pPr>
+      <w:r>
+        <w:rPr>
+          <w:color w:val="2F5496" w:themeColor="accent1" w:themeShade="BF"/>
+        </w:rPr>
+        <w:t>name: Run Python Script</w:t>
+      </w:r>
+    </w:p>
+    <w:p>
+      <w:pPr>
+        <w:pStyle w:val="ListParagraph"/>
+        <w:rPr>
+          <w:color w:val="2F5496" w:themeColor="accent1" w:themeShade="BF"/>
+        </w:rPr>
+      </w:pPr>
+    </w:p>
+    <w:p>
+      <w:pPr>
+        <w:pStyle w:val="ListParagraph"/>
+        <w:rPr>
+          <w:color w:val="2F5496" w:themeColor="accent1" w:themeShade="BF"/>
+        </w:rPr>
+      </w:pPr>
+      <w:r>
+        <w:rPr>
+          <w:color w:val="2F5496" w:themeColor="accent1" w:themeShade="BF"/>
+        </w:rPr>
+        <w:lastRenderedPageBreak/>
+        <w:t>on:</w:t>
+      </w:r>
+    </w:p>
+    <w:p>
+      <w:pPr>
+        <w:pStyle w:val="ListParagraph"/>
+        <w:rPr>
+          <w:color w:val="2F5496" w:themeColor="accent1" w:themeShade="BF"/>
+        </w:rPr>
+      </w:pPr>
+      <w:r>
+        <w:rPr>
+          <w:color w:val="2F5496" w:themeColor="accent1" w:themeShade="BF"/>
+        </w:rPr>
+        <w:t xml:space="preserve">  push:</w:t>
+      </w:r>
+    </w:p>
+    <w:p>
+      <w:pPr>
+        <w:pStyle w:val="ListParagraph"/>
+        <w:rPr>
+          <w:color w:val="2F5496" w:themeColor="accent1" w:themeShade="BF"/>
+        </w:rPr>
+      </w:pPr>
+      <w:r>
+        <w:rPr>
+          <w:color w:val="2F5496" w:themeColor="accent1" w:themeShade="BF"/>
+        </w:rPr>
+        <w:t xml:space="preserve">    branches:</w:t>
+      </w:r>
+    </w:p>
+    <w:p>
+      <w:pPr>
+        <w:pStyle w:val="ListParagraph"/>
+        <w:rPr>
+          <w:color w:val="2F5496" w:themeColor="accent1" w:themeShade="BF"/>
+        </w:rPr>
+      </w:pPr>
+      <w:r>
+        <w:rPr>
+          <w:color w:val="2F5496" w:themeColor="accent1" w:themeShade="BF"/>
+        </w:rPr>
+        <w:t xml:space="preserve">      - main</w:t>
+      </w:r>
+    </w:p>
+    <w:p>
+      <w:pPr>
+        <w:pStyle w:val="ListParagraph"/>
+        <w:rPr>
+          <w:color w:val="2F5496" w:themeColor="accent1" w:themeShade="BF"/>
+        </w:rPr>
+      </w:pPr>
+    </w:p>
+    <w:p>
+      <w:pPr>
+        <w:pStyle w:val="ListParagraph"/>
+        <w:rPr>
+          <w:color w:val="2F5496" w:themeColor="accent1" w:themeShade="BF"/>
+        </w:rPr>
+      </w:pPr>
+      <w:r>
+        <w:rPr>
+          <w:color w:val="2F5496" w:themeColor="accent1" w:themeShade="BF"/>
+        </w:rPr>
+        <w:t>jobs:</w:t>
+      </w:r>
+    </w:p>
+    <w:p>
+      <w:pPr>
+        <w:pStyle w:val="ListParagraph"/>
+        <w:rPr>
+          <w:color w:val="2F5496" w:themeColor="accent1" w:themeShade="BF"/>
+        </w:rPr>
+      </w:pPr>
+      <w:r>
+        <w:rPr>
+          <w:color w:val="2F5496" w:themeColor="accent1" w:themeShade="BF"/>
+        </w:rPr>
+        <w:t xml:space="preserve">  run-script:</w:t>
+      </w:r>
+    </w:p>
+    <w:p>
+      <w:pPr>
+        <w:pStyle w:val="ListParagraph"/>
+        <w:rPr>
+          <w:color w:val="2F5496" w:themeColor="accent1" w:themeShade="BF"/>
+        </w:rPr>
+      </w:pPr>
+      <w:r>
+        <w:rPr>
+          <w:color w:val="2F5496" w:themeColor="accent1" w:themeShade="BF"/>
+        </w:rPr>
+        <w:t xml:space="preserve">    runs-on: ubuntu-latest</w:t>
+      </w:r>
+    </w:p>
+    <w:p>
+      <w:pPr>
+        <w:pStyle w:val="ListParagraph"/>
+        <w:rPr>
+          <w:color w:val="2F5496" w:themeColor="accent1" w:themeShade="BF"/>
+        </w:rPr>
+      </w:pPr>
+    </w:p>
+    <w:p>
+      <w:pPr>
+        <w:pStyle w:val="ListParagraph"/>
+        <w:rPr>
+          <w:color w:val="2F5496" w:themeColor="accent1" w:themeShade="BF"/>
+        </w:rPr>
+      </w:pPr>
+      <w:r>
+        <w:rPr>
+          <w:color w:val="2F5496" w:themeColor="accent1" w:themeShade="BF"/>
+        </w:rPr>
+        <w:t xml:space="preserve">    steps:</w:t>
+      </w:r>
+    </w:p>
+    <w:p>
+      <w:pPr>
+        <w:pStyle w:val="ListParagraph"/>
+        <w:rPr>
+          <w:color w:val="2F5496" w:themeColor="accent1" w:themeShade="BF"/>
+        </w:rPr>
+      </w:pPr>
+      <w:r>
+        <w:rPr>
+          <w:color w:val="2F5496" w:themeColor="accent1" w:themeShade="BF"/>
+        </w:rPr>
+        <w:t xml:space="preserve">    - name: Checkout code</w:t>
+      </w:r>
+    </w:p>
+    <w:p>
+      <w:pPr>
+        <w:pStyle w:val="ListParagraph"/>
+        <w:rPr>
+          <w:color w:val="2F5496" w:themeColor="accent1" w:themeShade="BF"/>
+        </w:rPr>
+      </w:pPr>
+      <w:r>
+        <w:rPr>
+          <w:color w:val="2F5496" w:themeColor="accent1" w:themeShade="BF"/>
+        </w:rPr>
+        <w:t xml:space="preserve">      uses: actions/checkout@v3</w:t>
+      </w:r>
+    </w:p>
+    <w:p>
+      <w:pPr>
+        <w:pStyle w:val="ListParagraph"/>
+        <w:rPr>
+          <w:color w:val="2F5496" w:themeColor="accent1" w:themeShade="BF"/>
+        </w:rPr>
+      </w:pPr>
+    </w:p>
+    <w:p>
+      <w:pPr>
+        <w:pStyle w:val="ListParagraph"/>
+        <w:rPr>
+          <w:color w:val="2F5496" w:themeColor="accent1" w:themeShade="BF"/>
+        </w:rPr>
+      </w:pPr>
+      <w:r>
+        <w:rPr>
+          <w:color w:val="2F5496" w:themeColor="accent1" w:themeShade="BF"/>
+        </w:rPr>
+        <w:t xml:space="preserve">    - name: Set up Python</w:t>
+      </w:r>
+    </w:p>
+    <w:p>
+      <w:pPr>
+        <w:pStyle w:val="ListParagraph"/>
+        <w:rPr>
+          <w:color w:val="2F5496" w:themeColor="accent1" w:themeShade="BF"/>
+        </w:rPr>
+      </w:pPr>
+      <w:r>
+        <w:rPr>
+          <w:color w:val="2F5496" w:themeColor="accent1" w:themeShade="BF"/>
+        </w:rPr>
+        <w:t xml:space="preserve">      uses: actions/setup-python@v4</w:t>
+      </w:r>
+    </w:p>
+    <w:p>
+      <w:pPr>
+        <w:pStyle w:val="ListParagraph"/>
+        <w:rPr>
+          <w:color w:val="2F5496" w:themeColor="accent1" w:themeShade="BF"/>
+        </w:rPr>
+      </w:pPr>
+      <w:r>
+        <w:rPr>
+          <w:color w:val="2F5496" w:themeColor="accent1" w:themeShade="BF"/>
+        </w:rPr>
+        <w:t xml:space="preserve">      with:</w:t>
+      </w:r>
+    </w:p>
+    <w:p>
+      <w:pPr>
+        <w:pStyle w:val="ListParagraph"/>
+        <w:rPr>
+          <w:color w:val="2F5496" w:themeColor="accent1" w:themeShade="BF"/>
+        </w:rPr>
+      </w:pPr>
+      <w:r>
+        <w:rPr>
+          <w:color w:val="2F5496" w:themeColor="accent1" w:themeShade="BF"/>
+        </w:rPr>
+        <w:t xml:space="preserve">        python-version: '3.11'</w:t>
+      </w:r>
+    </w:p>
+    <w:p>
+      <w:pPr>
+        <w:pStyle w:val="ListParagraph"/>
+        <w:rPr>
+          <w:color w:val="2F5496" w:themeColor="accent1" w:themeShade="BF"/>
+        </w:rPr>
+      </w:pPr>
+    </w:p>
+    <w:p>
+      <w:pPr>
+        <w:pStyle w:val="ListParagraph"/>
+        <w:rPr>
+          <w:color w:val="2F5496" w:themeColor="accent1" w:themeShade="BF"/>
+        </w:rPr>
+      </w:pPr>
+      <w:r>
+        <w:rPr>
+          <w:color w:val="2F5496" w:themeColor="accent1" w:themeShade="BF"/>
+        </w:rPr>
+        <w:t xml:space="preserve">    - name: Run script</w:t>
+      </w:r>
+    </w:p>
+    <w:p>
+      <w:pPr>
+        <w:pStyle w:val="ListParagraph"/>
+        <w:rPr>
+          <w:color w:val="2F5496" w:themeColor="accent1" w:themeShade="BF"/>
+        </w:rPr>
+      </w:pPr>
+      <w:r>
+        <w:rPr>
+          <w:color w:val="2F5496" w:themeColor="accent1" w:themeShade="BF"/>
+        </w:rPr>
+        <w:t xml:space="preserve">      run: python first_script.py</w:t>
+      </w:r>
+    </w:p>
+    <w:p>
+      <w:pPr>
+        <w:pStyle w:val="ListParagraph"/>
+        <w:numPr>
+          <w:ilvl w:val="0"/>
+          <w:numId w:val="1"/>
+        </w:numPr>
+        <w:rPr>
+          <w:color w:val="2F5496" w:themeColor="accent1" w:themeShade="BF"/>
+        </w:rPr>
+      </w:pPr>
+      <w:r>
+        <w:t>Stage Pipeline File</w:t>
+      </w:r>
+    </w:p>
+    <w:p>
+      <w:pPr>
+        <w:pStyle w:val="ListParagraph"/>
+        <w:rPr>
+          <w:color w:val="2F5496" w:themeColor="accent1" w:themeShade="BF"/>
+        </w:rPr>
+      </w:pPr>
+      <w:r>
+        <w:rPr>
+          <w:color w:val="2F5496" w:themeColor="accent1" w:themeShade="BF"/>
+        </w:rPr>
+        <w:t>git add .</w:t>
+      </w:r>
+    </w:p>
+    <w:p>
+      <w:pPr>
+        <w:pStyle w:val="ListParagraph"/>
+        <w:numPr>
+          <w:ilvl w:val="0"/>
+          <w:numId w:val="1"/>
+        </w:numPr>
+      </w:pPr>
+      <w:r>
+        <w:t>Push Pipeline to GitHub</w:t>
+      </w:r>
+    </w:p>
+    <w:p>
+      <w:pPr>
+        <w:pStyle w:val="ListParagraph"/>
+        <w:rPr>
+          <w:color w:val="2F5496" w:themeColor="accent1" w:themeShade="BF"/>
+        </w:rPr>
+      </w:pPr>
+      <w:r>
+        <w:rPr>
+          <w:color w:val="2F5496" w:themeColor="accent1" w:themeShade="BF"/>
+        </w:rPr>
+        <w:t>git push</w:t>
+      </w:r>
+    </w:p>
+    <w:p>
+      <w:pPr>
+        <w:pStyle w:val="ListParagraph"/>
+        <w:numPr>
+          <w:ilvl w:val="0"/>
+          <w:numId w:val="1"/>
+        </w:numPr>
+      </w:pPr>
+      <w:r>
+        <w:t>(Optional) Add Logging to Pipeline</w:t>
+      </w:r>
+    </w:p>
+    <w:p>
+      <w:pPr>
+        <w:pStyle w:val="ListParagraph"/>
+        <w:rPr>
+          <w:color w:val="2F5496" w:themeColor="accent1" w:themeShade="BF"/>
+        </w:rPr>
+      </w:pPr>
+      <w:r>
+        <w:rPr>
+          <w:color w:val="2F5496" w:themeColor="accent1" w:themeShade="BF"/>
+        </w:rPr>
+        <w:t xml:space="preserve">    - name: Run script</w:t>
+      </w:r>
+    </w:p>
+    <w:p>
+      <w:pPr>
+        <w:pStyle w:val="ListParagraph"/>
+        <w:rPr>
+          <w:color w:val="2F5496" w:themeColor="accent1" w:themeShade="BF"/>
+        </w:rPr>
+      </w:pPr>
+      <w:r>
+        <w:rPr>
+          <w:color w:val="2F5496" w:themeColor="accent1" w:themeShade="BF"/>
+        </w:rPr>
+        <w:t xml:space="preserve">      run: |</w:t>
+      </w:r>
+    </w:p>
+    <w:p>
+      <w:pPr>
+        <w:pStyle w:val="ListParagraph"/>
+        <w:rPr>
+          <w:color w:val="2F5496" w:themeColor="accent1" w:themeShade="BF"/>
+        </w:rPr>
+      </w:pPr>
+      <w:r>
+        <w:rPr>
+          <w:color w:val="2F5496" w:themeColor="accent1" w:themeShade="BF"/>
+        </w:rPr>
+        <w:t xml:space="preserve">        echo "Starting automation..."</w:t>
+      </w:r>
+    </w:p>
+    <w:p>
+      <w:pPr>
+        <w:pStyle w:val="ListParagraph"/>
+        <w:rPr>
+          <w:color w:val="2F5496" w:themeColor="accent1" w:themeShade="BF"/>
+        </w:rPr>
+      </w:pPr>
+      <w:r>
+        <w:rPr>
+          <w:color w:val="2F5496" w:themeColor="accent1" w:themeShade="BF"/>
+        </w:rPr>
+        <w:t xml:space="preserve">        python first_script.py</w:t>
+      </w:r>
+    </w:p>
+    <w:p>
+      <w:pPr>
+        <w:pStyle w:val="ListParagraph"/>
+        <w:rPr>
+          <w:color w:val="2F5496" w:themeColor="accent1" w:themeShade="BF"/>
+        </w:rPr>
+      </w:pPr>
+      <w:r>
+        <w:rPr>
+          <w:color w:val="2F5496" w:themeColor="accent1" w:themeShade="BF"/>
+        </w:rPr>
+        <w:t xml:space="preserve">        echo "Pipeline complete."</w:t>
+      </w:r>
+    </w:p>
+    <w:p>
+      <w:pPr>
+        <w:pStyle w:val="ListParagraph"/>
+        <w:numPr>
+          <w:ilvl w:val="0"/>
+          <w:numId w:val="1"/>
+        </w:numPr>
+        <w:rPr>
+          <w:color w:val="2F5496" w:themeColor="accent1" w:themeShade="BF"/>
+        </w:rPr>
+      </w:pPr>
+      <w:r>
+        <w:t>Commit Updated Pipeline</w:t>
+      </w:r>
+    </w:p>
+    <w:p>
+      <w:pPr>
+        <w:pStyle w:val="ListParagraph"/>
+        <w:rPr>
+          <w:color w:val="2F5496" w:themeColor="accent1" w:themeShade="BF"/>
+        </w:rPr>
+      </w:pPr>
+      <w:r>
+        <w:rPr>
+          <w:color w:val="2F5496" w:themeColor="accent1" w:themeShade="BF"/>
+        </w:rPr>
+        <w:t>git add .</w:t>
+      </w:r>
+    </w:p>
+    <w:p>
+      <w:pPr>
+        <w:pStyle w:val="ListParagraph"/>
+        <w:rPr>
+          <w:color w:val="2F5496" w:themeColor="accent1" w:themeShade="BF"/>
+        </w:rPr>
+      </w:pPr>
+      <w:r>
+        <w:rPr>
+          <w:color w:val="2F5496" w:themeColor="accent1" w:themeShade="BF"/>
+        </w:rPr>
+        <w:t>git commit -m "Updated pipeline with logging"</w:t>
+      </w:r>
+    </w:p>
+    <w:p>
+      <w:pPr>
+        <w:pStyle w:val="ListParagraph"/>
+        <w:rPr>
+          <w:color w:val="2F5496" w:themeColor="accent1" w:themeShade="BF"/>
+        </w:rPr>
+      </w:pPr>
+      <w:r>
+        <w:rPr>
+          <w:color w:val="2F5496" w:themeColor="accent1" w:themeShade="BF"/>
+        </w:rPr>
+        <w:t>git push</w:t>
+      </w:r>
+    </w:p>
+    <w:p>
+      <w:pPr>
+        <w:pStyle w:val="ListParagraph"/>
+        <w:rPr>
+          <w:color w:val="2F5496" w:themeColor="accent1" w:themeShade="BF"/>
+        </w:rPr>
       </w:pPr>
     </w:p>
     <w:p>

</xml_diff>